<commit_message>
recent lab changes: 2025-05-30 12:43:07
</commit_message>
<xml_diff>
--- a/Курс 2/Структуры и алгоритмы обработки данных/Лабораторные/Сем4/05. Хеширование данных. Поиск данных в хеш-таблице/Отчёт_5.docx
+++ b/Курс 2/Структуры и алгоритмы обработки данных/Лабораторные/Сем4/05. Хеширование данных. Поиск данных в хеш-таблице/Отчёт_5.docx
@@ -1,6 +1,6 @@
 
 <file path=word/document.xml><?xml version="1.0" encoding="utf-8"?>
-<w:document xmlns:wpc="http://schemas.microsoft.com/office/word/2010/wordprocessingCanvas" xmlns:cx="http://schemas.microsoft.com/office/drawing/2014/chartex" xmlns:cx1="http://schemas.microsoft.com/office/drawing/2015/9/8/chartex" xmlns:cx2="http://schemas.microsoft.com/office/drawing/2015/10/21/chartex" xmlns:cx3="http://schemas.microsoft.com/office/drawing/2016/5/9/chartex" xmlns:cx4="http://schemas.microsoft.com/office/drawing/2016/5/10/chartex" xmlns:cx5="http://schemas.microsoft.com/office/drawing/2016/5/11/chartex" xmlns:cx6="http://schemas.microsoft.com/office/drawing/2016/5/12/chartex" xmlns:cx7="http://schemas.microsoft.com/office/drawing/2016/5/13/chartex" xmlns:cx8="http://schemas.microsoft.com/office/drawing/2016/5/14/chartex" xmlns:mc="http://schemas.openxmlformats.org/markup-compatibility/2006" xmlns:aink="http://schemas.microsoft.com/office/drawing/2016/ink" xmlns:am3d="http://schemas.microsoft.com/office/drawing/2017/model3d" xmlns:o="urn:schemas-microsoft-com:office:office" xmlns:oel="http://schemas.microsoft.com/office/2019/extlst" xmlns:r="http://schemas.openxmlformats.org/officeDocument/2006/relationships" xmlns:m="http://schemas.openxmlformats.org/officeDocument/2006/math" xmlns:v="urn:schemas-microsoft-com:vml" xmlns:wp14="http://schemas.microsoft.com/office/word/2010/wordprocessingDrawing" xmlns:wp="http://schemas.openxmlformats.org/drawingml/2006/wordprocessingDrawing" xmlns:w10="urn:schemas-microsoft-com:office:word" xmlns:w="http://schemas.openxmlformats.org/wordprocessingml/2006/main" xmlns:w14="http://schemas.microsoft.com/office/word/2010/wordml" xmlns:w15="http://schemas.microsoft.com/office/word/2012/wordml" xmlns:w16cex="http://schemas.microsoft.com/office/word/2018/wordml/cex" xmlns:w16cid="http://schemas.microsoft.com/office/word/2016/wordml/cid" xmlns:w16="http://schemas.microsoft.com/office/word/2018/wordml" xmlns:w16sdtdh="http://schemas.microsoft.com/office/word/2020/wordml/sdtdatahash" xmlns:w16se="http://schemas.microsoft.com/office/word/2015/wordml/symex" xmlns:wpg="http://schemas.microsoft.com/office/word/2010/wordprocessingGroup" xmlns:wpi="http://schemas.microsoft.com/office/word/2010/wordprocessingInk" xmlns:wne="http://schemas.microsoft.com/office/word/2006/wordml" xmlns:wps="http://schemas.microsoft.com/office/word/2010/wordprocessingShape" mc:Ignorable="w14 w15 w16se w16cid w16 w16cex w16sdtdh wp14">
+<w:document xmlns:wpc="http://schemas.microsoft.com/office/word/2010/wordprocessingCanvas" xmlns:cx="http://schemas.microsoft.com/office/drawing/2014/chartex" xmlns:mc="http://schemas.openxmlformats.org/markup-compatibility/2006" xmlns:o="urn:schemas-microsoft-com:office:office" xmlns:r="http://schemas.openxmlformats.org/officeDocument/2006/relationships" xmlns:m="http://schemas.openxmlformats.org/officeDocument/2006/math" xmlns:v="urn:schemas-microsoft-com:vml" xmlns:wp14="http://schemas.microsoft.com/office/word/2010/wordprocessingDrawing" xmlns:wp="http://schemas.openxmlformats.org/drawingml/2006/wordprocessingDrawing" xmlns:w10="urn:schemas-microsoft-com:office:word" xmlns:w="http://schemas.openxmlformats.org/wordprocessingml/2006/main" xmlns:w14="http://schemas.microsoft.com/office/word/2010/wordml" xmlns:w15="http://schemas.microsoft.com/office/word/2012/wordml" xmlns:w16se="http://schemas.microsoft.com/office/word/2015/wordml/symex" xmlns:wpg="http://schemas.microsoft.com/office/word/2010/wordprocessingGroup" xmlns:wpi="http://schemas.microsoft.com/office/word/2010/wordprocessingInk" xmlns:wne="http://schemas.microsoft.com/office/word/2006/wordml" xmlns:wps="http://schemas.microsoft.com/office/word/2010/wordprocessingShape" mc:Ignorable="w14 w15 w16se wp14">
   <w:body>
     <w:p>
       <w:pPr>
@@ -136,9 +136,6 @@
     <w:p>
       <w:pPr>
         <w:ind w:firstLine="0"/>
-        <w:rPr>
-          <w:lang w:val="en-US"/>
-        </w:rPr>
       </w:pPr>
       <w:r>
         <w:rPr>
@@ -1108,6 +1105,7 @@
                 <w:lang w:eastAsia="en-US"/>
                 <w14:ligatures w14:val="standardContextual"/>
               </w:rPr>
+              <w:lastRenderedPageBreak/>
               <w:t>}</w:t>
             </w:r>
           </w:p>
@@ -20150,7 +20148,6 @@
       <w:pPr>
         <w:rPr>
           <w:noProof/>
-          <w:lang w:val="en-US"/>
         </w:rPr>
       </w:pPr>
       <w:r>
@@ -20542,7 +20539,6 @@
           <w:color w:val="000000" w:themeColor="text1"/>
           <w:sz w:val="28"/>
           <w:szCs w:val="28"/>
-          <w:lang w:val="en-US"/>
         </w:rPr>
         <w:t xml:space="preserve">. </w:t>
       </w:r>
@@ -20863,52 +20859,68 @@
         </w:rPr>
         <w:t xml:space="preserve">Для хеш-функции </w:t>
       </w:r>
-      <w:r>
-        <w:rPr>
-          <w:noProof/>
-          <w:lang w:val="en-US"/>
-        </w:rPr>
-        <w:t>h</w:t>
-      </w:r>
-      <w:r>
-        <w:rPr>
-          <w:noProof/>
-        </w:rPr>
-        <w:t>(</w:t>
-      </w:r>
-      <w:r>
-        <w:rPr>
-          <w:noProof/>
-          <w:lang w:val="en-US"/>
-        </w:rPr>
-        <w:t>x</w:t>
-      </w:r>
-      <w:r>
-        <w:rPr>
-          <w:noProof/>
-        </w:rPr>
-        <w:t>)=</w:t>
-      </w:r>
-      <w:r>
-        <w:rPr>
-          <w:noProof/>
-          <w:lang w:val="en-US"/>
-        </w:rPr>
-        <w:t>x</w:t>
-      </w:r>
-      <w:r>
-        <w:rPr>
-          <w:noProof/>
-        </w:rPr>
-        <w:t>%</w:t>
-      </w:r>
-      <w:r>
-        <w:rPr>
-          <w:noProof/>
-          <w:lang w:val="en-US"/>
-        </w:rPr>
-        <w:t>B</w:t>
-      </w:r>
+      <m:oMath>
+        <m:r>
+          <w:rPr>
+            <w:rFonts w:ascii="Cambria Math" w:hAnsi="Cambria Math"/>
+            <w:noProof/>
+          </w:rPr>
+          <m:t>h(</m:t>
+        </m:r>
+        <m:r>
+          <w:rPr>
+            <w:rFonts w:ascii="Cambria Math" w:hAnsi="Cambria Math"/>
+            <w:noProof/>
+            <w:lang w:val="en-US"/>
+          </w:rPr>
+          <m:t>x</m:t>
+        </m:r>
+        <m:r>
+          <w:rPr>
+            <w:rFonts w:ascii="Cambria Math" w:hAnsi="Cambria Math"/>
+            <w:noProof/>
+          </w:rPr>
+          <m:t>)=(</m:t>
+        </m:r>
+        <m:r>
+          <w:rPr>
+            <w:rFonts w:ascii="Cambria Math" w:hAnsi="Cambria Math"/>
+            <w:noProof/>
+            <w:lang w:val="en-US"/>
+          </w:rPr>
+          <m:t>ax</m:t>
+        </m:r>
+        <m:r>
+          <w:rPr>
+            <w:rFonts w:ascii="Cambria Math" w:hAnsi="Cambria Math"/>
+            <w:noProof/>
+          </w:rPr>
+          <m:t>+</m:t>
+        </m:r>
+        <m:r>
+          <w:rPr>
+            <w:rFonts w:ascii="Cambria Math" w:hAnsi="Cambria Math"/>
+            <w:noProof/>
+            <w:lang w:val="en-US"/>
+          </w:rPr>
+          <m:t>c</m:t>
+        </m:r>
+        <m:r>
+          <w:rPr>
+            <w:rFonts w:ascii="Cambria Math" w:hAnsi="Cambria Math"/>
+            <w:noProof/>
+          </w:rPr>
+          <m:t>)%</m:t>
+        </m:r>
+        <m:r>
+          <w:rPr>
+            <w:rFonts w:ascii="Cambria Math" w:hAnsi="Cambria Math"/>
+            <w:noProof/>
+            <w:lang w:val="en-US"/>
+          </w:rPr>
+          <m:t>B</m:t>
+        </m:r>
+      </m:oMath>
       <w:r>
         <w:rPr>
           <w:noProof/>
@@ -21113,35 +21125,7 @@
           <w:noProof/>
           <w:lang w:val="en-US"/>
         </w:rPr>
-        <w:t>a=</w:t>
-      </w:r>
-      <w:r>
-        <w:rPr>
-          <w:noProof/>
-          <w:lang w:val="en-US"/>
-        </w:rPr>
-        <w:t>6</w:t>
-      </w:r>
-      <w:r>
-        <w:rPr>
-          <w:noProof/>
-          <w:lang w:val="en-US"/>
-        </w:rPr>
-        <w:t>, c=15 – 9</w:t>
-      </w:r>
-      <w:r>
-        <w:rPr>
-          <w:noProof/>
-          <w:lang w:val="en-US"/>
-        </w:rPr>
-        <w:t>5</w:t>
-      </w:r>
-      <w:r>
-        <w:rPr>
-          <w:noProof/>
-          <w:lang w:val="en-US"/>
-        </w:rPr>
-        <w:t xml:space="preserve">00 </w:t>
+        <w:t xml:space="preserve">a=6, c=15 – 9500 </w:t>
       </w:r>
       <w:r>
         <w:rPr>
@@ -21180,35 +21164,7 @@
           <w:noProof/>
           <w:lang w:val="en-US"/>
         </w:rPr>
-        <w:t>a=</w:t>
-      </w:r>
-      <w:r>
-        <w:rPr>
-          <w:noProof/>
-          <w:lang w:val="en-US"/>
-        </w:rPr>
-        <w:t>7</w:t>
-      </w:r>
-      <w:r>
-        <w:rPr>
-          <w:noProof/>
-          <w:lang w:val="en-US"/>
-        </w:rPr>
-        <w:t>, c=15 – 9</w:t>
-      </w:r>
-      <w:r>
-        <w:rPr>
-          <w:noProof/>
-          <w:lang w:val="en-US"/>
-        </w:rPr>
-        <w:t>0</w:t>
-      </w:r>
-      <w:r>
-        <w:rPr>
-          <w:noProof/>
-          <w:lang w:val="en-US"/>
-        </w:rPr>
-        <w:t xml:space="preserve">00 </w:t>
+        <w:t xml:space="preserve">a=7, c=15 – 9000 </w:t>
       </w:r>
       <w:r>
         <w:rPr>
@@ -21247,35 +21203,7 @@
           <w:noProof/>
           <w:lang w:val="en-US"/>
         </w:rPr>
-        <w:t>a=</w:t>
-      </w:r>
-      <w:r>
-        <w:rPr>
-          <w:noProof/>
-          <w:lang w:val="en-US"/>
-        </w:rPr>
-        <w:t>16</w:t>
-      </w:r>
-      <w:r>
-        <w:rPr>
-          <w:noProof/>
-          <w:lang w:val="en-US"/>
-        </w:rPr>
-        <w:t xml:space="preserve">, c=15 – </w:t>
-      </w:r>
-      <w:r>
-        <w:rPr>
-          <w:noProof/>
-          <w:lang w:val="en-US"/>
-        </w:rPr>
-        <w:t>9875</w:t>
-      </w:r>
-      <w:r>
-        <w:rPr>
-          <w:noProof/>
-          <w:lang w:val="en-US"/>
-        </w:rPr>
-        <w:t xml:space="preserve"> </w:t>
+        <w:t xml:space="preserve">a=16, c=15 – 9875 </w:t>
       </w:r>
       <w:r>
         <w:rPr>
@@ -21340,35 +21268,7 @@
           <w:noProof/>
           <w:lang w:val="en-US"/>
         </w:rPr>
-        <w:t>a=2</w:t>
-      </w:r>
-      <w:r>
-        <w:rPr>
-          <w:noProof/>
-          <w:lang w:val="en-US"/>
-        </w:rPr>
-        <w:t>5</w:t>
-      </w:r>
-      <w:r>
-        <w:rPr>
-          <w:noProof/>
-          <w:lang w:val="en-US"/>
-        </w:rPr>
-        <w:t>, c=15 – 99</w:t>
-      </w:r>
-      <w:r>
-        <w:rPr>
-          <w:noProof/>
-          <w:lang w:val="en-US"/>
-        </w:rPr>
-        <w:t>6</w:t>
-      </w:r>
-      <w:r>
-        <w:rPr>
-          <w:noProof/>
-          <w:lang w:val="en-US"/>
-        </w:rPr>
-        <w:t xml:space="preserve">0 </w:t>
+        <w:t xml:space="preserve">a=25, c=15 – 9960 </w:t>
       </w:r>
       <w:r>
         <w:rPr>
@@ -21484,6 +21384,154 @@
         </w:rPr>
         <w:t>.</w:t>
       </w:r>
+      <w:r>
+        <w:rPr>
+          <w:noProof/>
+        </w:rPr>
+        <w:t xml:space="preserve"> </w:t>
+      </w:r>
+      <w:r>
+        <w:rPr>
+          <w:noProof/>
+        </w:rPr>
+        <w:t xml:space="preserve">Большие проценты заполняемости могут быть получены при </w:t>
+      </w:r>
+      <m:oMath>
+        <m:r>
+          <w:rPr>
+            <w:rFonts w:ascii="Cambria Math" w:hAnsi="Cambria Math"/>
+            <w:noProof/>
+            <w:lang w:val="en-US"/>
+          </w:rPr>
+          <m:t>a</m:t>
+        </m:r>
+      </m:oMath>
+      <w:r>
+        <w:rPr>
+          <w:noProof/>
+        </w:rPr>
+        <w:t xml:space="preserve"> с минимальным общим количеством делителей с </w:t>
+      </w:r>
+      <m:oMath>
+        <m:r>
+          <w:rPr>
+            <w:rFonts w:ascii="Cambria Math" w:hAnsi="Cambria Math"/>
+            <w:noProof/>
+            <w:lang w:val="en-US"/>
+          </w:rPr>
+          <m:t>B</m:t>
+        </m:r>
+      </m:oMath>
+      <w:r>
+        <w:rPr>
+          <w:noProof/>
+        </w:rPr>
+        <w:t xml:space="preserve">, то есть </w:t>
+      </w:r>
+      <w:r>
+        <w:rPr>
+          <w:noProof/>
+        </w:rPr>
+        <w:t xml:space="preserve">процент заполняемости обратно пропорционален количеству общих делителей для </w:t>
+      </w:r>
+      <m:oMath>
+        <m:r>
+          <w:rPr>
+            <w:rFonts w:ascii="Cambria Math" w:hAnsi="Cambria Math"/>
+            <w:noProof/>
+            <w:lang w:val="en-US"/>
+          </w:rPr>
+          <m:t>a</m:t>
+        </m:r>
+      </m:oMath>
+      <w:r>
+        <w:rPr>
+          <w:noProof/>
+        </w:rPr>
+        <w:t xml:space="preserve"> </w:t>
+      </w:r>
+      <w:r>
+        <w:rPr>
+          <w:noProof/>
+        </w:rPr>
+        <w:t xml:space="preserve">и </w:t>
+      </w:r>
+      <m:oMath>
+        <m:r>
+          <w:rPr>
+            <w:rFonts w:ascii="Cambria Math" w:hAnsi="Cambria Math"/>
+            <w:noProof/>
+            <w:lang w:val="en-US"/>
+          </w:rPr>
+          <m:t>B</m:t>
+        </m:r>
+      </m:oMath>
+      <w:r>
+        <w:rPr>
+          <w:noProof/>
+        </w:rPr>
+        <w:t>.</w:t>
+      </w:r>
+      <w:r>
+        <w:rPr>
+          <w:noProof/>
+        </w:rPr>
+        <w:t xml:space="preserve"> </w:t>
+      </w:r>
+      <w:r>
+        <w:rPr>
+          <w:noProof/>
+        </w:rPr>
+        <w:t xml:space="preserve">Лучше всего выбирать числа </w:t>
+      </w:r>
+      <m:oMath>
+        <m:r>
+          <w:rPr>
+            <w:rFonts w:ascii="Cambria Math" w:hAnsi="Cambria Math"/>
+            <w:noProof/>
+            <w:lang w:val="en-US"/>
+          </w:rPr>
+          <m:t>a</m:t>
+        </m:r>
+      </m:oMath>
+      <w:r>
+        <w:rPr>
+          <w:noProof/>
+          <w:lang w:val="en-US"/>
+        </w:rPr>
+        <w:t xml:space="preserve"> </w:t>
+      </w:r>
+      <w:r>
+        <w:rPr>
+          <w:noProof/>
+        </w:rPr>
+        <w:t xml:space="preserve">и </w:t>
+      </w:r>
+      <m:oMath>
+        <m:r>
+          <w:rPr>
+            <w:rFonts w:ascii="Cambria Math" w:hAnsi="Cambria Math"/>
+            <w:noProof/>
+            <w:lang w:val="en-US"/>
+          </w:rPr>
+          <m:t>B</m:t>
+        </m:r>
+      </m:oMath>
+      <w:r>
+        <w:rPr>
+          <w:noProof/>
+          <w:lang w:val="en-US"/>
+        </w:rPr>
+        <w:t xml:space="preserve"> </w:t>
+      </w:r>
+      <w:r>
+        <w:rPr>
+          <w:noProof/>
+        </w:rPr>
+        <w:t>взаимно простыми.</w:t>
+      </w:r>
+      <w:bookmarkStart w:id="0" w:name="_GoBack"/>
+      <w:bookmarkEnd w:id="0"/>
     </w:p>
     <w:p>
       <w:pPr>
@@ -21635,7 +21683,7 @@
 </file>
 
 <file path=word/numbering.xml><?xml version="1.0" encoding="utf-8"?>
-<w:numbering xmlns:wpc="http://schemas.microsoft.com/office/word/2010/wordprocessingCanvas" xmlns:cx="http://schemas.microsoft.com/office/drawing/2014/chartex" xmlns:cx1="http://schemas.microsoft.com/office/drawing/2015/9/8/chartex" xmlns:cx2="http://schemas.microsoft.com/office/drawing/2015/10/21/chartex" xmlns:cx3="http://schemas.microsoft.com/office/drawing/2016/5/9/chartex" xmlns:cx4="http://schemas.microsoft.com/office/drawing/2016/5/10/chartex" xmlns:cx5="http://schemas.microsoft.com/office/drawing/2016/5/11/chartex" xmlns:cx6="http://schemas.microsoft.com/office/drawing/2016/5/12/chartex" xmlns:cx7="http://schemas.microsoft.com/office/drawing/2016/5/13/chartex" xmlns:cx8="http://schemas.microsoft.com/office/drawing/2016/5/14/chartex" xmlns:mc="http://schemas.openxmlformats.org/markup-compatibility/2006" xmlns:aink="http://schemas.microsoft.com/office/drawing/2016/ink" xmlns:am3d="http://schemas.microsoft.com/office/drawing/2017/model3d" xmlns:o="urn:schemas-microsoft-com:office:office" xmlns:oel="http://schemas.microsoft.com/office/2019/extlst" xmlns:r="http://schemas.openxmlformats.org/officeDocument/2006/relationships" xmlns:m="http://schemas.openxmlformats.org/officeDocument/2006/math" xmlns:v="urn:schemas-microsoft-com:vml" xmlns:wp14="http://schemas.microsoft.com/office/word/2010/wordprocessingDrawing" xmlns:wp="http://schemas.openxmlformats.org/drawingml/2006/wordprocessingDrawing" xmlns:w10="urn:schemas-microsoft-com:office:word" xmlns:w="http://schemas.openxmlformats.org/wordprocessingml/2006/main" xmlns:w14="http://schemas.microsoft.com/office/word/2010/wordml" xmlns:w15="http://schemas.microsoft.com/office/word/2012/wordml" xmlns:w16cex="http://schemas.microsoft.com/office/word/2018/wordml/cex" xmlns:w16cid="http://schemas.microsoft.com/office/word/2016/wordml/cid" xmlns:w16="http://schemas.microsoft.com/office/word/2018/wordml" xmlns:w16sdtdh="http://schemas.microsoft.com/office/word/2020/wordml/sdtdatahash" xmlns:w16se="http://schemas.microsoft.com/office/word/2015/wordml/symex" xmlns:wpg="http://schemas.microsoft.com/office/word/2010/wordprocessingGroup" xmlns:wpi="http://schemas.microsoft.com/office/word/2010/wordprocessingInk" xmlns:wne="http://schemas.microsoft.com/office/word/2006/wordml" xmlns:wps="http://schemas.microsoft.com/office/word/2010/wordprocessingShape" mc:Ignorable="w14 w15 w16se w16cid w16 w16cex w16sdtdh wp14">
+<w:numbering xmlns:wpc="http://schemas.microsoft.com/office/word/2010/wordprocessingCanvas" xmlns:cx="http://schemas.microsoft.com/office/drawing/2014/chartex" xmlns:mc="http://schemas.openxmlformats.org/markup-compatibility/2006" xmlns:o="urn:schemas-microsoft-com:office:office" xmlns:r="http://schemas.openxmlformats.org/officeDocument/2006/relationships" xmlns:m="http://schemas.openxmlformats.org/officeDocument/2006/math" xmlns:v="urn:schemas-microsoft-com:vml" xmlns:wp14="http://schemas.microsoft.com/office/word/2010/wordprocessingDrawing" xmlns:wp="http://schemas.openxmlformats.org/drawingml/2006/wordprocessingDrawing" xmlns:w10="urn:schemas-microsoft-com:office:word" xmlns:w="http://schemas.openxmlformats.org/wordprocessingml/2006/main" xmlns:w14="http://schemas.microsoft.com/office/word/2010/wordml" xmlns:w15="http://schemas.microsoft.com/office/word/2012/wordml" xmlns:w16se="http://schemas.microsoft.com/office/word/2015/wordml/symex" xmlns:wpg="http://schemas.microsoft.com/office/word/2010/wordprocessingGroup" xmlns:wpi="http://schemas.microsoft.com/office/word/2010/wordprocessingInk" xmlns:wne="http://schemas.microsoft.com/office/word/2006/wordml" xmlns:wps="http://schemas.microsoft.com/office/word/2010/wordprocessingShape" mc:Ignorable="w14 w15 w16se wp14">
   <w:abstractNum w:abstractNumId="0" w15:restartNumberingAfterBreak="0">
     <w:nsid w:val="20E763C6"/>
     <w:multiLevelType w:val="hybridMultilevel"/>
@@ -22314,29 +22362,29 @@
       </w:rPr>
     </w:lvl>
   </w:abstractNum>
-  <w:num w:numId="1" w16cid:durableId="1896625268">
+  <w:num w:numId="1">
     <w:abstractNumId w:val="3"/>
   </w:num>
-  <w:num w:numId="2" w16cid:durableId="965625928">
+  <w:num w:numId="2">
     <w:abstractNumId w:val="1"/>
   </w:num>
-  <w:num w:numId="3" w16cid:durableId="348529105">
+  <w:num w:numId="3">
     <w:abstractNumId w:val="2"/>
   </w:num>
-  <w:num w:numId="4" w16cid:durableId="1937976330">
+  <w:num w:numId="4">
     <w:abstractNumId w:val="5"/>
   </w:num>
-  <w:num w:numId="5" w16cid:durableId="1109008279">
+  <w:num w:numId="5">
     <w:abstractNumId w:val="0"/>
   </w:num>
-  <w:num w:numId="6" w16cid:durableId="176430797">
+  <w:num w:numId="6">
     <w:abstractNumId w:val="4"/>
   </w:num>
 </w:numbering>
 </file>
 
 <file path=word/styles.xml><?xml version="1.0" encoding="utf-8"?>
-<w:styles xmlns:mc="http://schemas.openxmlformats.org/markup-compatibility/2006" xmlns:r="http://schemas.openxmlformats.org/officeDocument/2006/relationships" xmlns:w="http://schemas.openxmlformats.org/wordprocessingml/2006/main" xmlns:w14="http://schemas.microsoft.com/office/word/2010/wordml" xmlns:w15="http://schemas.microsoft.com/office/word/2012/wordml" xmlns:w16cex="http://schemas.microsoft.com/office/word/2018/wordml/cex" xmlns:w16cid="http://schemas.microsoft.com/office/word/2016/wordml/cid" xmlns:w16="http://schemas.microsoft.com/office/word/2018/wordml" xmlns:w16sdtdh="http://schemas.microsoft.com/office/word/2020/wordml/sdtdatahash" xmlns:w16se="http://schemas.microsoft.com/office/word/2015/wordml/symex" mc:Ignorable="w14 w15 w16se w16cid w16 w16cex w16sdtdh">
+<w:styles xmlns:mc="http://schemas.openxmlformats.org/markup-compatibility/2006" xmlns:r="http://schemas.openxmlformats.org/officeDocument/2006/relationships" xmlns:w="http://schemas.openxmlformats.org/wordprocessingml/2006/main" xmlns:w14="http://schemas.microsoft.com/office/word/2010/wordml" xmlns:w15="http://schemas.microsoft.com/office/word/2012/wordml" xmlns:w16se="http://schemas.microsoft.com/office/word/2015/wordml/symex" mc:Ignorable="w14 w15 w16se">
   <w:docDefaults>
     <w:rPrDefault>
       <w:rPr>
@@ -22357,7 +22405,7 @@
       </w:pPr>
     </w:pPrDefault>
   </w:docDefaults>
-  <w:latentStyles w:defLockedState="0" w:defUIPriority="99" w:defSemiHidden="0" w:defUnhideWhenUsed="0" w:defQFormat="0" w:count="376">
+  <w:latentStyles w:defLockedState="0" w:defUIPriority="99" w:defSemiHidden="0" w:defUnhideWhenUsed="0" w:defQFormat="0" w:count="371">
     <w:lsdException w:name="Normal" w:uiPriority="0" w:qFormat="1"/>
     <w:lsdException w:name="heading 1" w:uiPriority="9" w:qFormat="1"/>
     <w:lsdException w:name="heading 2" w:semiHidden="1" w:uiPriority="9" w:unhideWhenUsed="1" w:qFormat="1"/>
@@ -22729,11 +22777,6 @@
     <w:lsdException w:name="List Table 5 Dark Accent 6" w:uiPriority="50"/>
     <w:lsdException w:name="List Table 6 Colorful Accent 6" w:uiPriority="51"/>
     <w:lsdException w:name="List Table 7 Colorful Accent 6" w:uiPriority="52"/>
-    <w:lsdException w:name="Mention" w:semiHidden="1" w:unhideWhenUsed="1"/>
-    <w:lsdException w:name="Smart Hyperlink" w:semiHidden="1" w:unhideWhenUsed="1"/>
-    <w:lsdException w:name="Hashtag" w:semiHidden="1" w:unhideWhenUsed="1"/>
-    <w:lsdException w:name="Unresolved Mention" w:semiHidden="1" w:unhideWhenUsed="1"/>
-    <w:lsdException w:name="Smart Link" w:semiHidden="1" w:unhideWhenUsed="1"/>
   </w:latentStyles>
   <w:style w:type="paragraph" w:default="1" w:styleId="a">
     <w:name w:val="Normal"/>
@@ -22754,6 +22797,7 @@
   <w:style w:type="character" w:default="1" w:styleId="a0">
     <w:name w:val="Default Paragraph Font"/>
     <w:uiPriority w:val="1"/>
+    <w:semiHidden/>
     <w:unhideWhenUsed/>
   </w:style>
   <w:style w:type="table" w:default="1" w:styleId="a1">
@@ -23200,7 +23244,7 @@
 </file>
 
 <file path=customXml/itemProps1.xml><?xml version="1.0" encoding="utf-8"?>
-<ds:datastoreItem xmlns:ds="http://schemas.openxmlformats.org/officeDocument/2006/customXml" ds:itemID="{3EDD846A-3B32-41AA-BEDE-019AE320E4F0}">
+<ds:datastoreItem xmlns:ds="http://schemas.openxmlformats.org/officeDocument/2006/customXml" ds:itemID="{A031E612-9865-43F1-ACEB-C7BBA06A0E34}">
   <ds:schemaRefs>
     <ds:schemaRef ds:uri="http://schemas.openxmlformats.org/officeDocument/2006/bibliography"/>
   </ds:schemaRefs>

</xml_diff>